<commit_message>
v3.01 — Kategori-nyckeltalskort i nyckeltal-griden (period-styrda)
Lägger till ett kompakt minikort per kategori direkt i nyckeltal-raden med emoji, aktuellt värde, netto-avkastning kr/% och periodindikator. Uppdaterar Beskrivning v301 och Kursmaterial v301 med dokumentation av nya korten.

Co-Authored-By: Claude Sonnet 4.6 <noreply@anthropic.com>
</commit_message>
<xml_diff>
--- a/Strategiportfoljen_Beskrivning_v301.docx
+++ b/Strategiportfoljen_Beskrivning_v301.docx
@@ -2542,6 +2542,191 @@
           <w:sz w:val="20"/>
         </w:rPr>
         <w:t>ℹ️  På mobil/iPad visas samma data som kompakta kort istället för tabell, anpassat för pekskärm.</w:t>
+      </w:r>
+    </w:p>
+    <w:p>
+      <w:r>
+        <w:br w:type="page"/>
+      </w:r>
+    </w:p>
+    <w:p>
+      <w:pPr>
+        <w:spacing w:after="120"/>
+      </w:pPr>
+      <w:r>
+        <w:rPr>
+          <w:b/>
+          <w:color w:val="1E3A5F"/>
+          <w:sz w:val="32"/>
+        </w:rPr>
+        <w:t>Tillägg till avsnitt 7 — Kategori-nyckeltalskort i griden</w:t>
+      </w:r>
+    </w:p>
+    <w:p>
+      <w:pPr>
+        <w:spacing w:after="240"/>
+      </w:pPr>
+      <w:r>
+        <w:rPr>
+          <w:i/>
+          <w:color w:val="6B7280"/>
+          <w:sz w:val="22"/>
+        </w:rPr>
+        <w:t>Avkastning per kategori direkt i nyckeltal-raden — utan ett klick</w:t>
+      </w:r>
+    </w:p>
+    <w:p>
+      <w:pPr>
+        <w:spacing w:after="100"/>
+      </w:pPr>
+      <w:r>
+        <w:rPr>
+          <w:color w:val="111827"/>
+          <w:sz w:val="22"/>
+        </w:rPr>
+        <w:t>Utöver kategoriutvecklingstabellen (som visas under Periodutveckling-kortet) finns nu även ett kompakt minikort per kategori direkt i nyckeltal-griden — i samma rad som Totalt portföljvärde, Innehavens värde och övriga globala nyckeltal.</w:t>
+      </w:r>
+    </w:p>
+    <w:p>
+      <w:pPr>
+        <w:spacing w:before="240" w:after="80"/>
+      </w:pPr>
+      <w:r>
+        <w:rPr>
+          <w:b/>
+          <w:color w:val="1E3A5F"/>
+          <w:sz w:val="26"/>
+        </w:rPr>
+        <w:t>Vad minikorten visar</w:t>
+      </w:r>
+    </w:p>
+    <w:p>
+      <w:pPr>
+        <w:pStyle w:val="ListBullet"/>
+        <w:spacing w:after="60"/>
+      </w:pPr>
+      <w:r>
+        <w:rPr>
+          <w:color w:val="111827"/>
+          <w:sz w:val="22"/>
+        </w:rPr>
+        <w:t>Kategoriemoji och namn</w:t>
+      </w:r>
+    </w:p>
+    <w:p>
+      <w:pPr>
+        <w:pStyle w:val="ListBullet"/>
+        <w:spacing w:after="60"/>
+      </w:pPr>
+      <w:r>
+        <w:rPr>
+          <w:color w:val="111827"/>
+          <w:sz w:val="22"/>
+        </w:rPr>
+        <w:t>Aktuellt marknadsvärde i kronor (uppdateras med importerade kurser)</w:t>
+      </w:r>
+    </w:p>
+    <w:p>
+      <w:pPr>
+        <w:pStyle w:val="ListBullet"/>
+        <w:spacing w:after="60"/>
+      </w:pPr>
+      <w:r>
+        <w:rPr>
+          <w:color w:val="111827"/>
+          <w:sz w:val="22"/>
+        </w:rPr>
+        <w:t>Netto-avkastning i kronor — röd/grön färgkod</w:t>
+      </w:r>
+    </w:p>
+    <w:p>
+      <w:pPr>
+        <w:pStyle w:val="ListBullet"/>
+        <w:spacing w:after="60"/>
+      </w:pPr>
+      <w:r>
+        <w:rPr>
+          <w:color w:val="111827"/>
+          <w:sz w:val="22"/>
+        </w:rPr>
+        <w:t>Netto-avkastning i procent</w:t>
+      </w:r>
+    </w:p>
+    <w:p>
+      <w:pPr>
+        <w:pStyle w:val="ListBullet"/>
+        <w:spacing w:after="60"/>
+      </w:pPr>
+      <w:r>
+        <w:rPr>
+          <w:color w:val="111827"/>
+          <w:sz w:val="22"/>
+        </w:rPr>
+        <w:t>En liten etikett: ”periodnamn” (t.ex. ”30D”) eller ”sedan köp” om historik saknas</w:t>
+      </w:r>
+    </w:p>
+    <w:p>
+      <w:pPr>
+        <w:spacing w:before="240" w:after="80"/>
+      </w:pPr>
+      <w:r>
+        <w:rPr>
+          <w:b/>
+          <w:color w:val="1E3A5F"/>
+          <w:sz w:val="26"/>
+        </w:rPr>
+        <w:t>Periodstyrning</w:t>
+      </w:r>
+    </w:p>
+    <w:p>
+      <w:pPr>
+        <w:spacing w:after="100"/>
+      </w:pPr>
+      <w:r>
+        <w:rPr>
+          <w:color w:val="111827"/>
+          <w:sz w:val="22"/>
+        </w:rPr>
+        <w:t>Korten uppdateras automatiskt när du byter period i periodfältet. Om den valda perioden har matchande historikdata (importerade positionsfiler med kategorivärden) visas perioden-baserad avkastning. Annars visas orealiserad vinst från GAV som fallback.</w:t>
+      </w:r>
+    </w:p>
+    <w:p>
+      <w:pPr>
+        <w:spacing w:after="120"/>
+        <w:ind w:left="288"/>
+      </w:pPr>
+      <w:r>
+        <w:rPr>
+          <w:i/>
+          <w:color w:val="6B7280"/>
+          <w:sz w:val="20"/>
+        </w:rPr>
+        <w:t>ℹ️  Korten läggs till dynamiskt i JavaScript — de syns bara när du har innehav inlagda i appen.</w:t>
+      </w:r>
+    </w:p>
+    <w:p>
+      <w:pPr>
+        <w:spacing w:before="240" w:after="80"/>
+      </w:pPr>
+      <w:r>
+        <w:rPr>
+          <w:b/>
+          <w:color w:val="1E3A5F"/>
+          <w:sz w:val="26"/>
+        </w:rPr>
+        <w:t>Visuell design</w:t>
+      </w:r>
+    </w:p>
+    <w:p>
+      <w:pPr>
+        <w:spacing w:after="100"/>
+      </w:pPr>
+      <w:r>
+        <w:rPr>
+          <w:color w:val="111827"/>
+          <w:sz w:val="22"/>
+        </w:rPr>
+        <w:t>Varje minikort har en 3px färgad vänsterkant med kategorins färg (blå för Ankaret, grön för Kassaflödet, lila för Infrastrukturen osv.). Kortet är något smalare än de globala nyckeltalskortten men följer samma grid-layout — auto-fit baserat på skärmbredd.</w:t>
       </w:r>
     </w:p>
     <w:sectPr>

</xml_diff>